<commit_message>
Formatear fecha para los documentos
</commit_message>
<xml_diff>
--- a/src/main/plantillas/Extension.docx
+++ b/src/main/plantillas/Extension.docx
@@ -287,7 +287,7 @@
           <w:tab w:val="left" w:pos="7938"/>
         </w:tabs>
         <w:spacing w:line="240" w:lineRule="auto"/>
-        <w:ind w:left="2268" w:hanging="2268"/>
+        <w:ind w:left="2835" w:hanging="2835"/>
         <w:jc w:val="both"/>
         <w:rPr>
           <w:rFonts w:ascii="Arial" w:eastAsia="Times New Roman" w:hAnsi="Arial" w:cs="Arial"/>
@@ -329,16 +329,6 @@
       </w:r>
       <w:r>
         <w:rPr>
-          <w:rFonts w:ascii="Arial" w:eastAsia="Times New Roman" w:hAnsi="Arial" w:cs="Arial"/>
-          <w:color w:val="000000" w:themeColor="text1"/>
-          <w:sz w:val="20"/>
-          <w:szCs w:val="20"/>
-          <w:lang w:eastAsia="es-ES"/>
-        </w:rPr>
-        <w:tab/>
-      </w:r>
-      <w:r>
-        <w:rPr>
           <w:rFonts w:ascii="Arial" w:hAnsi="Arial" w:cs="Arial"/>
           <w:b/>
           <w:bCs/>
@@ -667,6 +657,7 @@
           <w:color w:val="000000"/>
           <w:sz w:val="20"/>
           <w:szCs w:val="20"/>
+          <w:lang w:val="es-ES"/>
         </w:rPr>
       </w:pPr>
     </w:p>
@@ -683,6 +674,7 @@
       </w:pPr>
       <w:r>
         <w:rPr>
+          <w:rFonts w:ascii="Arial" w:hAnsi="Arial" w:cs="Arial"/>
           <w:noProof/>
         </w:rPr>
         <w:drawing>
@@ -737,9 +729,16 @@
       </w:r>
       <w:r>
         <w:rPr>
+          <w:rFonts w:ascii="Arial" w:hAnsi="Arial" w:cs="Arial"/>
           <w:noProof/>
         </w:rPr>
-        <w:t>Lima,</w:t>
+        <w:t>Lima</w:t>
+      </w:r>
+      <w:r>
+        <w:rPr>
+          <w:noProof/>
+        </w:rPr>
+        <w:t>,</w:t>
       </w:r>
       <w:r>
         <w:rPr>
@@ -753,8 +752,6 @@
       <w:r>
         <w:rPr>
           <w:rFonts w:ascii="Arial" w:hAnsi="Arial" w:cs="Arial"/>
-          <w:b/>
-          <w:bCs/>
           <w:lang w:val="es-ES"/>
         </w:rPr>
         <w:t>${</w:t>
@@ -763,8 +760,6 @@
       <w:r>
         <w:rPr>
           <w:rFonts w:ascii="Arial" w:hAnsi="Arial" w:cs="Arial"/>
-          <w:b/>
-          <w:bCs/>
         </w:rPr>
         <w:t>AprDesde</w:t>
       </w:r>
@@ -772,8 +767,6 @@
       <w:r>
         <w:rPr>
           <w:rFonts w:ascii="Arial" w:hAnsi="Arial" w:cs="Arial"/>
-          <w:b/>
-          <w:bCs/>
           <w:lang w:val="es-ES"/>
         </w:rPr>
         <w:t>}</w:t>

</xml_diff>